<commit_message>
initialize commit for tic_tac_toe automation
</commit_message>
<xml_diff>
--- a/test_cases.docx
+++ b/test_cases.docx
@@ -2300,27 +2300,7 @@
                 <w:sz w:val="19"/>
                 <w:szCs w:val="19"/>
               </w:rPr>
-              <w:t>1. Enter a name (</w:t>
-            </w:r>
-            <w:proofErr w:type="gramStart"/>
-            <w:r>
-              <w:rPr>
-                <w:rFonts w:asciiTheme="majorBidi" w:hAnsiTheme="majorBidi" w:cstheme="majorBidi"/>
-                <w:color w:val="1A1A1A"/>
-                <w:sz w:val="19"/>
-                <w:szCs w:val="19"/>
-              </w:rPr>
-              <w:t>e.g.</w:t>
-            </w:r>
-            <w:proofErr w:type="gramEnd"/>
-            <w:r>
-              <w:rPr>
-                <w:rFonts w:asciiTheme="majorBidi" w:hAnsiTheme="majorBidi" w:cstheme="majorBidi"/>
-                <w:color w:val="1A1A1A"/>
-                <w:sz w:val="19"/>
-                <w:szCs w:val="19"/>
-              </w:rPr>
-              <w:t xml:space="preserve"> "Sara")</w:t>
+              <w:t>1. Enter a name (e.g. "Sara")</w:t>
             </w:r>
             <w:r>
               <w:rPr>
@@ -2684,13 +2664,7 @@
               <w:rPr>
                 <w:rFonts w:asciiTheme="majorBidi" w:eastAsia="Times New Roman" w:hAnsiTheme="majorBidi" w:cstheme="majorBidi"/>
               </w:rPr>
-              <w:t>This name is already taken. Try logging in</w:t>
-            </w:r>
-            <w:r>
-              <w:rPr>
-                <w:rFonts w:asciiTheme="majorBidi" w:eastAsia="Times New Roman" w:hAnsiTheme="majorBidi" w:cstheme="majorBidi"/>
-              </w:rPr>
-              <w:t>”</w:t>
+              <w:t>This name is already taken. Try logging in”</w:t>
             </w:r>
           </w:p>
         </w:tc>
@@ -3092,31 +3066,7 @@
                 <w:sz w:val="19"/>
                 <w:szCs w:val="19"/>
               </w:rPr>
-              <w:t xml:space="preserve">Login </w:t>
-            </w:r>
-            <w:proofErr w:type="gramStart"/>
-            <w:r>
-              <w:rPr>
-                <w:rFonts w:asciiTheme="majorBidi" w:hAnsiTheme="majorBidi" w:cstheme="majorBidi"/>
-                <w:b/>
-                <w:bCs/>
-                <w:color w:val="1A1A1A"/>
-                <w:sz w:val="19"/>
-                <w:szCs w:val="19"/>
-              </w:rPr>
-              <w:t>user(</w:t>
-            </w:r>
-            <w:proofErr w:type="gramEnd"/>
-            <w:r>
-              <w:rPr>
-                <w:rFonts w:asciiTheme="majorBidi" w:hAnsiTheme="majorBidi" w:cstheme="majorBidi"/>
-                <w:b/>
-                <w:bCs/>
-                <w:color w:val="1A1A1A"/>
-                <w:sz w:val="19"/>
-                <w:szCs w:val="19"/>
-              </w:rPr>
-              <w:t>does not exist)</w:t>
+              <w:t>Login user(does not exist)</w:t>
             </w:r>
           </w:p>
         </w:tc>
@@ -7689,27 +7639,7 @@
                 <w:sz w:val="19"/>
                 <w:szCs w:val="19"/>
               </w:rPr>
-              <w:t xml:space="preserve">Logged in; </w:t>
-            </w:r>
-            <w:proofErr w:type="spellStart"/>
-            <w:r>
-              <w:rPr>
-                <w:rFonts w:asciiTheme="majorBidi" w:hAnsiTheme="majorBidi" w:cstheme="majorBidi"/>
-                <w:color w:val="1A1A1A"/>
-                <w:sz w:val="19"/>
-                <w:szCs w:val="19"/>
-              </w:rPr>
-              <w:t>centre</w:t>
-            </w:r>
-            <w:proofErr w:type="spellEnd"/>
-            <w:r>
-              <w:rPr>
-                <w:rFonts w:asciiTheme="majorBidi" w:hAnsiTheme="majorBidi" w:cstheme="majorBidi"/>
-                <w:color w:val="1A1A1A"/>
-                <w:sz w:val="19"/>
-                <w:szCs w:val="19"/>
-              </w:rPr>
-              <w:t xml:space="preserve"> cell already filled</w:t>
+              <w:t>Logged in; centre cell already filled</w:t>
             </w:r>
           </w:p>
         </w:tc>
@@ -7743,27 +7673,7 @@
                 <w:sz w:val="19"/>
                 <w:szCs w:val="19"/>
               </w:rPr>
-              <w:t xml:space="preserve">1. Fill </w:t>
-            </w:r>
-            <w:proofErr w:type="spellStart"/>
-            <w:r>
-              <w:rPr>
-                <w:rFonts w:asciiTheme="majorBidi" w:hAnsiTheme="majorBidi" w:cstheme="majorBidi"/>
-                <w:color w:val="1A1A1A"/>
-                <w:sz w:val="19"/>
-                <w:szCs w:val="19"/>
-              </w:rPr>
-              <w:t>centre</w:t>
-            </w:r>
-            <w:proofErr w:type="spellEnd"/>
-            <w:r>
-              <w:rPr>
-                <w:rFonts w:asciiTheme="majorBidi" w:hAnsiTheme="majorBidi" w:cstheme="majorBidi"/>
-                <w:color w:val="1A1A1A"/>
-                <w:sz w:val="19"/>
-                <w:szCs w:val="19"/>
-              </w:rPr>
-              <w:t xml:space="preserve"> cell </w:t>
+              <w:t xml:space="preserve">1. Fill centre cell </w:t>
             </w:r>
             <w:r>
               <w:rPr>
@@ -7773,14 +7683,6 @@
                 <w:szCs w:val="19"/>
               </w:rPr>
               <w:br/>
-            </w:r>
-            <w:r>
-              <w:rPr>
-                <w:rFonts w:asciiTheme="majorBidi" w:hAnsiTheme="majorBidi" w:cstheme="majorBidi"/>
-                <w:color w:val="1A1A1A"/>
-                <w:sz w:val="19"/>
-                <w:szCs w:val="19"/>
-              </w:rPr>
               <w:t xml:space="preserve">2. Resize to 375px wide, then back to 1280px 3. Click </w:t>
             </w:r>
             <w:r>
@@ -7791,27 +7693,7 @@
                 <w:szCs w:val="19"/>
               </w:rPr>
               <w:lastRenderedPageBreak/>
-              <w:t xml:space="preserve">the already-filled </w:t>
-            </w:r>
-            <w:proofErr w:type="spellStart"/>
-            <w:r>
-              <w:rPr>
-                <w:rFonts w:asciiTheme="majorBidi" w:hAnsiTheme="majorBidi" w:cstheme="majorBidi"/>
-                <w:color w:val="1A1A1A"/>
-                <w:sz w:val="19"/>
-                <w:szCs w:val="19"/>
-              </w:rPr>
-              <w:t>centre</w:t>
-            </w:r>
-            <w:proofErr w:type="spellEnd"/>
-            <w:r>
-              <w:rPr>
-                <w:rFonts w:asciiTheme="majorBidi" w:hAnsiTheme="majorBidi" w:cstheme="majorBidi"/>
-                <w:color w:val="1A1A1A"/>
-                <w:sz w:val="19"/>
-                <w:szCs w:val="19"/>
-              </w:rPr>
-              <w:t xml:space="preserve"> cell again</w:t>
+              <w:t>the already-filled centre cell again</w:t>
             </w:r>
           </w:p>
         </w:tc>
@@ -7916,6 +7798,17 @@
                 <w:szCs w:val="19"/>
               </w:rPr>
             </w:pPr>
+            <w:r>
+              <w:rPr>
+                <w:rFonts w:asciiTheme="majorBidi" w:hAnsiTheme="majorBidi" w:cstheme="majorBidi"/>
+                <w:b/>
+                <w:bCs/>
+                <w:color w:val="1A1A1A"/>
+                <w:sz w:val="19"/>
+                <w:szCs w:val="19"/>
+              </w:rPr>
+              <w:t>BUG-03</w:t>
+            </w:r>
           </w:p>
         </w:tc>
         <w:tc>
@@ -7946,6 +7839,17 @@
                 <w:szCs w:val="19"/>
               </w:rPr>
             </w:pPr>
+            <w:r>
+              <w:rPr>
+                <w:rFonts w:asciiTheme="majorBidi" w:hAnsiTheme="majorBidi" w:cstheme="majorBidi"/>
+                <w:b/>
+                <w:bCs/>
+                <w:color w:val="1A1A1A"/>
+                <w:sz w:val="19"/>
+                <w:szCs w:val="19"/>
+              </w:rPr>
+              <w:t>Click on Hint Button</w:t>
+            </w:r>
           </w:p>
         </w:tc>
         <w:tc>
@@ -7974,6 +7878,15 @@
                 <w:szCs w:val="19"/>
               </w:rPr>
             </w:pPr>
+            <w:r>
+              <w:rPr>
+                <w:rFonts w:asciiTheme="majorBidi" w:hAnsiTheme="majorBidi" w:cstheme="majorBidi"/>
+                <w:color w:val="1A1A1A"/>
+                <w:sz w:val="19"/>
+                <w:szCs w:val="19"/>
+              </w:rPr>
+              <w:t>Responsive</w:t>
+            </w:r>
           </w:p>
         </w:tc>
         <w:tc>
@@ -8002,6 +7915,15 @@
                 <w:szCs w:val="19"/>
               </w:rPr>
             </w:pPr>
+            <w:r>
+              <w:rPr>
+                <w:rFonts w:asciiTheme="majorBidi" w:hAnsiTheme="majorBidi" w:cstheme="majorBidi"/>
+                <w:color w:val="1A1A1A"/>
+                <w:sz w:val="19"/>
+                <w:szCs w:val="19"/>
+              </w:rPr>
+              <w:t>Logged in; centre cell already filled</w:t>
+            </w:r>
           </w:p>
         </w:tc>
         <w:tc>
@@ -8030,6 +7952,52 @@
                 <w:szCs w:val="19"/>
               </w:rPr>
             </w:pPr>
+            <w:r>
+              <w:rPr>
+                <w:rFonts w:asciiTheme="majorBidi" w:hAnsiTheme="majorBidi" w:cstheme="majorBidi"/>
+                <w:color w:val="1A1A1A"/>
+                <w:sz w:val="19"/>
+                <w:szCs w:val="19"/>
+              </w:rPr>
+              <w:t xml:space="preserve">1. Fill </w:t>
+            </w:r>
+            <w:r>
+              <w:rPr>
+                <w:rFonts w:asciiTheme="majorBidi" w:hAnsiTheme="majorBidi" w:cstheme="majorBidi"/>
+                <w:color w:val="1A1A1A"/>
+                <w:sz w:val="19"/>
+                <w:szCs w:val="19"/>
+              </w:rPr>
+              <w:t>First</w:t>
+            </w:r>
+            <w:r>
+              <w:rPr>
+                <w:rFonts w:asciiTheme="majorBidi" w:hAnsiTheme="majorBidi" w:cstheme="majorBidi"/>
+                <w:color w:val="1A1A1A"/>
+                <w:sz w:val="19"/>
+                <w:szCs w:val="19"/>
+              </w:rPr>
+              <w:t xml:space="preserve"> cell </w:t>
+            </w:r>
+            <w:r>
+              <w:rPr>
+                <w:rFonts w:asciiTheme="majorBidi" w:hAnsiTheme="majorBidi" w:cstheme="majorBidi"/>
+                <w:color w:val="1A1A1A"/>
+                <w:sz w:val="19"/>
+                <w:szCs w:val="19"/>
+              </w:rPr>
+              <w:br/>
+              <w:t xml:space="preserve">3. Click </w:t>
+            </w:r>
+            <w:r>
+              <w:rPr>
+                <w:rFonts w:asciiTheme="majorBidi" w:hAnsiTheme="majorBidi" w:cstheme="majorBidi"/>
+                <w:color w:val="1A1A1A"/>
+                <w:sz w:val="19"/>
+                <w:szCs w:val="19"/>
+              </w:rPr>
+              <w:t>Hint Button, show the cell that is clicked</w:t>
+            </w:r>
           </w:p>
         </w:tc>
         <w:tc>
@@ -8058,6 +8026,25 @@
                 <w:szCs w:val="19"/>
               </w:rPr>
             </w:pPr>
+            <w:r>
+              <w:rPr>
+                <w:rFonts w:asciiTheme="majorBidi" w:hAnsiTheme="majorBidi" w:cstheme="majorBidi"/>
+                <w:color w:val="1A1A1A"/>
+                <w:sz w:val="19"/>
+                <w:szCs w:val="19"/>
+              </w:rPr>
+              <w:t>Click is ignored;</w:t>
+            </w:r>
+            <w:r>
+              <w:rPr>
+                <w:rFonts w:asciiTheme="majorBidi" w:hAnsiTheme="majorBidi" w:cstheme="majorBidi"/>
+                <w:color w:val="1A1A1A"/>
+                <w:sz w:val="19"/>
+                <w:szCs w:val="19"/>
+              </w:rPr>
+              <w:br/>
+              <w:t>Hint show the other cell that is not clicked</w:t>
+            </w:r>
           </w:p>
         </w:tc>
         <w:tc>
@@ -8088,6 +8075,17 @@
                 <w:szCs w:val="19"/>
               </w:rPr>
             </w:pPr>
+            <w:r>
+              <w:rPr>
+                <w:rFonts w:asciiTheme="majorBidi" w:hAnsiTheme="majorBidi" w:cstheme="majorBidi"/>
+                <w:b/>
+                <w:bCs/>
+                <w:color w:val="1A1A1A"/>
+                <w:sz w:val="19"/>
+                <w:szCs w:val="19"/>
+              </w:rPr>
+              <w:t>Yes</w:t>
+            </w:r>
           </w:p>
         </w:tc>
       </w:tr>

</xml_diff>